<commit_message>
Vincula cada política con su procedimiento (hipervínculo clicable en el .docx)
En "Documentos relacionados" de las 12 políticas que tienen procedimiento, agrega
"Procedimiento(s) vinculado(s): ..." como hipervínculo relativo al .docx del
procedimiento (se abre con Ctrl+clic en Word/LibreOffice con el repo clonado):
POL-01→PROC-06/07, POL-02→08, POL-03→02/03, POL-05→01, POL-07→09, POL-08→10,
POL-09→11, POL-10→12, POL-11→05, POL-13→14, POL-14→13, POL-15→04.
POL-04, POL-06 y POL-12 no tienen procedimiento dedicado (ver análisis de brechas).

Co-Authored-By: Claude Opus 4.8 (1M context) <noreply@anthropic.com>
</commit_message>
<xml_diff>
--- a/01-politicas/POL-SGSI-01 - Política de control de acceso.docx
+++ b/01-politicas/POL-SGSI-01 - Política de control de acceso.docx
@@ -1170,6 +1170,35 @@
       </w:r>
     </w:p>
     <w:p>
+      <w:r>
+        <w:rPr>
+          <w:b/>
+        </w:rPr>
+        <w:t xml:space="preserve">Procedimiento(s) vinculado(s): </w:t>
+      </w:r>
+      <w:hyperlink r:id="rIdLnk1" w:history="1">
+        <w:r>
+          <w:rPr>
+            <w:color w:val="0563C1"/>
+            <w:u w:val="single"/>
+          </w:rPr>
+          <w:t xml:space="preserve">PROC-SGSI-06 — Procedimiento de alta, modificación y baja de accesos</w:t>
+        </w:r>
+      </w:hyperlink>
+      <w:r>
+        <w:t xml:space="preserve"> · </w:t>
+      </w:r>
+      <w:hyperlink r:id="rIdLnk2" w:history="1">
+        <w:r>
+          <w:rPr>
+            <w:color w:val="0563C1"/>
+            <w:u w:val="single"/>
+          </w:rPr>
+          <w:t xml:space="preserve">PROC-SGSI-07 — Procedimiento de revisión periódica de accesos</w:t>
+        </w:r>
+      </w:hyperlink>
+    </w:p>
+    <w:p>
       <w:pPr>
         <w:spacing w:after="40"/>
       </w:pPr>

</xml_diff>